<commit_message>
Change reports to view, and updated
</commit_message>
<xml_diff>
--- a/40482879 (Jack)/40482879_Design_Spec.docx
+++ b/40482879 (Jack)/40482879_Design_Spec.docx
@@ -126,16 +126,7 @@
           <w:sz w:val="20"/>
           <w:szCs w:val="20"/>
         </w:rPr>
-        <w:t xml:space="preserve">The pre-posed system is a web-based database application to help the Council for the Curriculum, Examinations &amp; Assessments (CCEA), CCEA is Northern Ireland’s qualifications regulator, established in 1994 and sponsored by the department of education NI, it develops </w:t>
-      </w:r>
-      <w:r>
-        <w:rPr>
-          <w:b w:val="false"/>
-          <w:bCs w:val="false"/>
-          <w:sz w:val="20"/>
-          <w:szCs w:val="20"/>
-        </w:rPr>
-        <w:t>the NI curriculum, sets and awards different qualifications such as GCSE’s, A-Levels and AS-Level qualifications, CCEA also regulates access arrangements that allow candidates with disabilities or learning needs to sit examinations fairly.</w:t>
+        <w:t>The pre-posed system is a web-based database application to help the Council for the Curriculum, Examinations &amp; Assessments (CCEA), CCEA is Northern Ireland’s qualifications regulator, established in 1994 and sponsored by the department of education NI, it develops the NI curriculum, sets and awards different qualifications such as GCSE’s, A-Levels and AS-Level qualifications, CCEA also regulates access arrangements that allow candidates with disabilities or learning needs to sit examinations fairly.</w:t>
       </w:r>
     </w:p>
     <w:p>
@@ -355,31 +346,16 @@
       </w:r>
       <w:r>
         <w:rPr>
-          <w:rFonts w:ascii="Liberation Serif" w:hAnsi="Liberation Serif"/>
-          <w:b w:val="false"/>
-          <w:i w:val="false"/>
-          <w:caps w:val="false"/>
-          <w:smallCaps w:val="false"/>
-          <w:color w:val="000000"/>
-          <w:spacing w:val="0"/>
-          <w:sz w:val="20"/>
-          <w:szCs w:val="20"/>
-        </w:rPr>
-        <w:t xml:space="preserve">vocational training for the vulnerable, including persons with disabilities, indigenous peoples and children in vulnerable situations”, </w:t>
-      </w:r>
-      <w:r>
-        <w:rPr>
-          <w:rFonts w:ascii="Liberation Serif" w:hAnsi="Liberation Serif"/>
-          <w:b w:val="false"/>
-          <w:i w:val="false"/>
-          <w:caps w:val="false"/>
-          <w:smallCaps w:val="false"/>
-          <w:color w:val="000000"/>
-          <w:spacing w:val="0"/>
-          <w:sz w:val="20"/>
-          <w:szCs w:val="20"/>
-        </w:rPr>
-        <w:t>by enabling schools to compare outcomes between supported and non-supported students, the system would give schools the data needed to evidence inclusive practice, and identify where support is falling short</w:t>
+          <w:b w:val="false"/>
+          <w:i w:val="false"/>
+          <w:caps w:val="false"/>
+          <w:smallCaps w:val="false"/>
+          <w:color w:val="000000"/>
+          <w:spacing w:val="0"/>
+          <w:sz w:val="20"/>
+          <w:szCs w:val="20"/>
+        </w:rPr>
+        <w:t>vocational training for the vulnerable, including persons with disabilities, indigenous peoples and children in vulnerable situations”, by enabling schools to compare outcomes between supported and non-supported students, the system would give schools the data needed to evidence inclusive practice, and identify where support is falling short</w:t>
       </w:r>
     </w:p>
     <w:p>
@@ -402,7 +378,6 @@
       </w:pPr>
       <w:r>
         <w:rPr>
-          <w:rFonts w:ascii="Liberation Serif" w:hAnsi="Liberation Serif"/>
           <w:b/>
           <w:bCs/>
           <w:i w:val="false"/>
@@ -435,7 +410,6 @@
       </w:pPr>
       <w:r>
         <w:rPr>
-          <w:rFonts w:ascii="Liberation Serif" w:hAnsi="Liberation Serif"/>
           <w:b/>
           <w:bCs/>
           <w:i w:val="false"/>
@@ -469,7 +443,6 @@
       </w:pPr>
       <w:r>
         <w:rPr>
-          <w:rFonts w:ascii="Liberation Serif" w:hAnsi="Liberation Serif"/>
           <w:b w:val="false"/>
           <w:bCs w:val="false"/>
           <w:i w:val="false"/>
@@ -507,7 +480,6 @@
       </w:pPr>
       <w:r>
         <w:rPr>
-          <w:rFonts w:ascii="Liberation Serif" w:hAnsi="Liberation Serif"/>
           <w:b/>
           <w:bCs/>
           <w:i w:val="false"/>
@@ -522,7 +494,6 @@
       </w:r>
       <w:r>
         <w:rPr>
-          <w:rFonts w:ascii="Liberation Serif" w:hAnsi="Liberation Serif"/>
           <w:b w:val="false"/>
           <w:bCs w:val="false"/>
           <w:i w:val="false"/>
@@ -560,7 +531,6 @@
       </w:pPr>
       <w:r>
         <w:rPr>
-          <w:rFonts w:ascii="Liberation Serif" w:hAnsi="Liberation Serif"/>
           <w:b/>
           <w:bCs/>
           <w:i w:val="false"/>
@@ -575,7 +545,6 @@
       </w:r>
       <w:r>
         <w:rPr>
-          <w:rFonts w:ascii="Liberation Serif" w:hAnsi="Liberation Serif"/>
           <w:b w:val="false"/>
           <w:bCs w:val="false"/>
           <w:i w:val="false"/>
@@ -613,81 +582,70 @@
       </w:pPr>
       <w:r>
         <w:rPr>
+          <w:b/>
+          <w:bCs/>
+          <w:i w:val="false"/>
+          <w:caps w:val="false"/>
+          <w:smallCaps w:val="false"/>
+          <w:color w:val="000000"/>
+          <w:spacing w:val="0"/>
+          <w:sz w:val="20"/>
+          <w:szCs w:val="20"/>
+        </w:rPr>
+        <w:t>Senior leadership</w:t>
+      </w:r>
+      <w:r>
+        <w:rPr>
+          <w:b w:val="false"/>
+          <w:bCs w:val="false"/>
+          <w:i w:val="false"/>
+          <w:caps w:val="false"/>
+          <w:smallCaps w:val="false"/>
+          <w:color w:val="000000"/>
+          <w:spacing w:val="0"/>
+          <w:sz w:val="20"/>
+          <w:szCs w:val="20"/>
+        </w:rPr>
+        <w:t>: review reports on gaps between supported and non-supported students, filter by year group, to overall create new possible outcomes / strategies</w:t>
+      </w:r>
+    </w:p>
+    <w:p>
+      <w:pPr>
+        <w:pStyle w:val="Normal"/>
+        <w:bidi w:val="0"/>
+        <w:jc w:val="start"/>
+        <w:rPr>
+          <w:b w:val="false"/>
+          <w:bCs w:val="false"/>
+        </w:rPr>
+      </w:pPr>
+      <w:r>
+        <w:rPr>
+          <w:b w:val="false"/>
+          <w:bCs w:val="false"/>
+        </w:rPr>
+      </w:r>
+    </w:p>
+    <w:p>
+      <w:pPr>
+        <w:pStyle w:val="Normal"/>
+        <w:bidi w:val="0"/>
+        <w:jc w:val="start"/>
+        <w:rPr>
           <w:rFonts w:ascii="Liberation Serif" w:hAnsi="Liberation Serif"/>
-          <w:b/>
-          <w:bCs/>
-          <w:i w:val="false"/>
-          <w:caps w:val="false"/>
-          <w:smallCaps w:val="false"/>
-          <w:color w:val="000000"/>
-          <w:spacing w:val="0"/>
-          <w:sz w:val="20"/>
-          <w:szCs w:val="20"/>
-        </w:rPr>
-        <w:t>Senior leadership</w:t>
-      </w:r>
-      <w:r>
-        <w:rPr>
-          <w:rFonts w:ascii="Liberation Serif" w:hAnsi="Liberation Serif"/>
-          <w:b w:val="false"/>
-          <w:bCs w:val="false"/>
-          <w:i w:val="false"/>
-          <w:caps w:val="false"/>
-          <w:smallCaps w:val="false"/>
-          <w:color w:val="000000"/>
-          <w:spacing w:val="0"/>
-          <w:sz w:val="20"/>
-          <w:szCs w:val="20"/>
-        </w:rPr>
-        <w:t>: review reports on gaps between supported and non-supported students, filter by year group, to overall create new possible outcomes / strategies</w:t>
-      </w:r>
-    </w:p>
-    <w:p>
-      <w:pPr>
-        <w:pStyle w:val="Normal"/>
-        <w:bidi w:val="0"/>
-        <w:jc w:val="start"/>
-        <w:rPr>
-          <w:b w:val="false"/>
-          <w:bCs w:val="false"/>
-        </w:rPr>
-      </w:pPr>
-      <w:r>
-        <w:rPr>
-          <w:rFonts w:ascii="Liberation Serif" w:hAnsi="Liberation Serif"/>
-          <w:b w:val="false"/>
-          <w:bCs w:val="false"/>
-          <w:i w:val="false"/>
-          <w:caps w:val="false"/>
-          <w:smallCaps w:val="false"/>
-          <w:color w:val="000000"/>
-          <w:spacing w:val="0"/>
-          <w:sz w:val="20"/>
-          <w:szCs w:val="20"/>
-        </w:rPr>
-      </w:r>
-    </w:p>
-    <w:p>
-      <w:pPr>
-        <w:pStyle w:val="Normal"/>
-        <w:bidi w:val="0"/>
-        <w:jc w:val="start"/>
-        <w:rPr>
-          <w:rFonts w:ascii="Liberation Serif" w:hAnsi="Liberation Serif"/>
-          <w:b w:val="false"/>
-          <w:bCs w:val="false"/>
-          <w:i w:val="false"/>
-          <w:caps w:val="false"/>
-          <w:smallCaps w:val="false"/>
-          <w:color w:val="000000"/>
-          <w:spacing w:val="0"/>
-          <w:sz w:val="20"/>
-          <w:szCs w:val="20"/>
-        </w:rPr>
-      </w:pPr>
-      <w:r>
-        <w:rPr>
-          <w:rFonts w:ascii="Liberation Serif" w:hAnsi="Liberation Serif"/>
+          <w:b w:val="false"/>
+          <w:bCs w:val="false"/>
+          <w:i w:val="false"/>
+          <w:caps w:val="false"/>
+          <w:smallCaps w:val="false"/>
+          <w:color w:val="000000"/>
+          <w:spacing w:val="0"/>
+          <w:sz w:val="20"/>
+          <w:szCs w:val="20"/>
+        </w:rPr>
+      </w:pPr>
+      <w:r>
+        <w:rPr>
           <w:b/>
           <w:bCs/>
           <w:i w:val="false"/>
@@ -708,6 +666,238 @@
         <w:jc w:val="start"/>
         <w:rPr>
           <w:rFonts w:ascii="Liberation Serif" w:hAnsi="Liberation Serif"/>
+          <w:b w:val="false"/>
+          <w:bCs w:val="false"/>
+          <w:i w:val="false"/>
+          <w:caps w:val="false"/>
+          <w:smallCaps w:val="false"/>
+          <w:color w:val="000000"/>
+          <w:spacing w:val="0"/>
+          <w:sz w:val="20"/>
+          <w:szCs w:val="20"/>
+        </w:rPr>
+      </w:pPr>
+      <w:r>
+        <w:rPr>
+          <w:b w:val="false"/>
+          <w:bCs w:val="false"/>
+          <w:i w:val="false"/>
+          <w:caps w:val="false"/>
+          <w:smallCaps w:val="false"/>
+          <w:color w:val="000000"/>
+          <w:spacing w:val="0"/>
+          <w:sz w:val="20"/>
+          <w:szCs w:val="20"/>
+        </w:rPr>
+        <w:t>The design is formed from three public sources which are:</w:t>
+      </w:r>
+    </w:p>
+    <w:p>
+      <w:pPr>
+        <w:pStyle w:val="Normal"/>
+        <w:numPr>
+          <w:ilvl w:val="0"/>
+          <w:numId w:val="2"/>
+        </w:numPr>
+        <w:bidi w:val="0"/>
+        <w:jc w:val="start"/>
+        <w:rPr>
+          <w:rFonts w:ascii="Liberation Serif" w:hAnsi="Liberation Serif"/>
+          <w:b w:val="false"/>
+          <w:bCs w:val="false"/>
+          <w:i w:val="false"/>
+          <w:caps w:val="false"/>
+          <w:smallCaps w:val="false"/>
+          <w:color w:val="000000"/>
+          <w:spacing w:val="0"/>
+          <w:sz w:val="20"/>
+          <w:szCs w:val="20"/>
+        </w:rPr>
+      </w:pPr>
+      <w:r>
+        <w:rPr>
+          <w:b/>
+          <w:bCs/>
+          <w:i w:val="false"/>
+          <w:caps w:val="false"/>
+          <w:smallCaps w:val="false"/>
+          <w:color w:val="000000"/>
+          <w:spacing w:val="0"/>
+          <w:sz w:val="20"/>
+          <w:szCs w:val="20"/>
+        </w:rPr>
+        <w:t>CCEA’s Access Arrangements guidance</w:t>
+      </w:r>
+      <w:r>
+        <w:rPr>
+          <w:b w:val="false"/>
+          <w:bCs w:val="false"/>
+          <w:i w:val="false"/>
+          <w:caps w:val="false"/>
+          <w:smallCaps w:val="false"/>
+          <w:color w:val="000000"/>
+          <w:spacing w:val="0"/>
+          <w:sz w:val="20"/>
+          <w:szCs w:val="20"/>
+        </w:rPr>
+        <w:t>: This is what will shape how assistance is done</w:t>
+      </w:r>
+    </w:p>
+    <w:p>
+      <w:pPr>
+        <w:pStyle w:val="Normal"/>
+        <w:numPr>
+          <w:ilvl w:val="0"/>
+          <w:numId w:val="2"/>
+        </w:numPr>
+        <w:bidi w:val="0"/>
+        <w:jc w:val="start"/>
+        <w:rPr>
+          <w:rFonts w:ascii="Liberation Serif" w:hAnsi="Liberation Serif"/>
+          <w:b/>
+          <w:bCs/>
+          <w:i w:val="false"/>
+          <w:caps w:val="false"/>
+          <w:smallCaps w:val="false"/>
+          <w:color w:val="000000"/>
+          <w:spacing w:val="0"/>
+          <w:sz w:val="20"/>
+          <w:szCs w:val="20"/>
+        </w:rPr>
+      </w:pPr>
+      <w:r>
+        <w:rPr>
+          <w:b/>
+          <w:bCs/>
+          <w:i w:val="false"/>
+          <w:caps w:val="false"/>
+          <w:smallCaps w:val="false"/>
+          <w:color w:val="000000"/>
+          <w:spacing w:val="0"/>
+          <w:sz w:val="20"/>
+          <w:szCs w:val="20"/>
+        </w:rPr>
+        <w:t>JCQ AARA 25-26 regulations</w:t>
+      </w:r>
+      <w:r>
+        <w:rPr>
+          <w:b w:val="false"/>
+          <w:bCs w:val="false"/>
+          <w:i w:val="false"/>
+          <w:caps w:val="false"/>
+          <w:smallCaps w:val="false"/>
+          <w:color w:val="000000"/>
+          <w:spacing w:val="0"/>
+          <w:sz w:val="20"/>
+          <w:szCs w:val="20"/>
+        </w:rPr>
+        <w:t>: CCEA themselves follow, which inform the modelling of specific assistance types such as  (Extra time 25%, Reader, Scribe)</w:t>
+      </w:r>
+    </w:p>
+    <w:p>
+      <w:pPr>
+        <w:pStyle w:val="Normal"/>
+        <w:numPr>
+          <w:ilvl w:val="0"/>
+          <w:numId w:val="2"/>
+        </w:numPr>
+        <w:bidi w:val="0"/>
+        <w:jc w:val="start"/>
+        <w:rPr>
+          <w:rFonts w:ascii="Liberation Serif" w:hAnsi="Liberation Serif"/>
+          <w:b/>
+          <w:bCs/>
+          <w:i w:val="false"/>
+          <w:caps w:val="false"/>
+          <w:smallCaps w:val="false"/>
+          <w:color w:val="000000"/>
+          <w:spacing w:val="0"/>
+          <w:sz w:val="20"/>
+          <w:szCs w:val="20"/>
+        </w:rPr>
+      </w:pPr>
+      <w:r>
+        <w:rPr>
+          <w:b/>
+          <w:bCs/>
+          <w:i w:val="false"/>
+          <w:caps w:val="false"/>
+          <w:smallCaps w:val="false"/>
+          <w:color w:val="000000"/>
+          <w:spacing w:val="0"/>
+          <w:sz w:val="20"/>
+          <w:szCs w:val="20"/>
+        </w:rPr>
+        <w:t>CCEA’s SEN and inclusion resources</w:t>
+      </w:r>
+      <w:r>
+        <w:rPr>
+          <w:b w:val="false"/>
+          <w:bCs w:val="false"/>
+          <w:i w:val="false"/>
+          <w:caps w:val="false"/>
+          <w:smallCaps w:val="false"/>
+          <w:color w:val="000000"/>
+          <w:spacing w:val="0"/>
+          <w:sz w:val="20"/>
+          <w:szCs w:val="20"/>
+        </w:rPr>
+        <w:t xml:space="preserve">: </w:t>
+      </w:r>
+      <w:r>
+        <w:rPr>
+          <w:b w:val="false"/>
+          <w:bCs w:val="false"/>
+          <w:i w:val="false"/>
+          <w:caps w:val="false"/>
+          <w:smallCaps w:val="false"/>
+          <w:color w:val="000000"/>
+          <w:spacing w:val="0"/>
+          <w:sz w:val="20"/>
+          <w:szCs w:val="20"/>
+        </w:rPr>
+        <w:t>Which help distinguish disability category structure ( Learning, Physical, Mental Health, etc)</w:t>
+      </w:r>
+    </w:p>
+    <w:p>
+      <w:pPr>
+        <w:pStyle w:val="Normal"/>
+        <w:bidi w:val="0"/>
+        <w:jc w:val="start"/>
+        <w:rPr>
+          <w:rFonts w:ascii="Liberation Serif" w:hAnsi="Liberation Serif"/>
+          <w:b w:val="false"/>
+          <w:bCs w:val="false"/>
+          <w:i w:val="false"/>
+          <w:caps w:val="false"/>
+          <w:smallCaps w:val="false"/>
+          <w:color w:val="000000"/>
+          <w:spacing w:val="0"/>
+          <w:sz w:val="20"/>
+          <w:szCs w:val="20"/>
+        </w:rPr>
+      </w:pPr>
+      <w:r>
+        <w:rPr>
+          <w:b w:val="false"/>
+          <w:bCs w:val="false"/>
+          <w:i w:val="false"/>
+          <w:caps w:val="false"/>
+          <w:smallCaps w:val="false"/>
+          <w:color w:val="000000"/>
+          <w:spacing w:val="0"/>
+          <w:sz w:val="20"/>
+          <w:szCs w:val="20"/>
+        </w:rPr>
+      </w:r>
+    </w:p>
+    <w:p>
+      <w:pPr>
+        <w:pStyle w:val="Normal"/>
+        <w:bidi w:val="0"/>
+        <w:jc w:val="start"/>
+        <w:rPr>
+          <w:rFonts w:ascii="Liberation Serif" w:hAnsi="Liberation Serif"/>
           <w:b/>
           <w:bCs/>
           <w:i w:val="false"/>
@@ -721,7 +911,6 @@
       </w:pPr>
       <w:r>
         <w:rPr>
-          <w:rFonts w:ascii="Liberation Serif" w:hAnsi="Liberation Serif"/>
           <w:b/>
           <w:bCs/>
           <w:i w:val="false"/>
@@ -732,9 +921,14 @@
           <w:sz w:val="28"/>
           <w:szCs w:val="28"/>
         </w:rPr>
-        <w:t xml:space="preserve"> </w:t>
-      </w:r>
-      <w:r>
+        <w:t>Initial ER diagram model</w:t>
+      </w:r>
+    </w:p>
+    <w:p>
+      <w:pPr>
+        <w:pStyle w:val="Normal"/>
+        <w:bidi w:val="0"/>
+        <w:jc w:val="start"/>
         <w:rPr>
           <w:rFonts w:ascii="Liberation Serif" w:hAnsi="Liberation Serif"/>
           <w:b w:val="false"/>
@@ -747,7 +941,98 @@
           <w:sz w:val="20"/>
           <w:szCs w:val="20"/>
         </w:rPr>
-        <w:t>hello</w:t>
+      </w:pPr>
+      <w:r>
+        <w:rPr>
+          <w:b w:val="false"/>
+          <w:bCs w:val="false"/>
+          <w:i w:val="false"/>
+          <w:caps w:val="false"/>
+          <w:smallCaps w:val="false"/>
+          <w:color w:val="000000"/>
+          <w:spacing w:val="0"/>
+          <w:sz w:val="20"/>
+          <w:szCs w:val="20"/>
+        </w:rPr>
+        <w:t>The ER diagram below shows the key entities of the proposed system and their relationships, Many -to- many relationships are solved through linking tables, the most prominent table being the ternary relationship of the Student_Disability</w:t>
+      </w:r>
+      <w:r>
+        <w:rPr>
+          <w:b w:val="false"/>
+          <w:bCs w:val="false"/>
+          <w:i w:val="false"/>
+          <w:caps w:val="false"/>
+          <w:smallCaps w:val="false"/>
+          <w:color w:val="000000"/>
+          <w:spacing w:val="0"/>
+          <w:sz w:val="20"/>
+          <w:szCs w:val="20"/>
+        </w:rPr>
+        <w:t>_Assistance table, this allows one student to have multiple disabilities with different assistance for each.</w:t>
+      </w:r>
+    </w:p>
+    <w:p>
+      <w:pPr>
+        <w:pStyle w:val="Normal"/>
+        <w:bidi w:val="0"/>
+        <w:jc w:val="start"/>
+        <w:rPr>
+          <w:rFonts w:ascii="Liberation Serif" w:hAnsi="Liberation Serif"/>
+          <w:b w:val="false"/>
+          <w:bCs w:val="false"/>
+          <w:i w:val="false"/>
+          <w:caps w:val="false"/>
+          <w:smallCaps w:val="false"/>
+          <w:color w:val="000000"/>
+          <w:spacing w:val="0"/>
+          <w:sz w:val="20"/>
+          <w:szCs w:val="20"/>
+        </w:rPr>
+      </w:pPr>
+      <w:r>
+        <w:rPr>
+          <w:b w:val="false"/>
+          <w:bCs w:val="false"/>
+          <w:i w:val="false"/>
+          <w:caps w:val="false"/>
+          <w:smallCaps w:val="false"/>
+          <w:color w:val="000000"/>
+          <w:spacing w:val="0"/>
+          <w:sz w:val="20"/>
+          <w:szCs w:val="20"/>
+        </w:rPr>
+      </w:r>
+    </w:p>
+    <w:p>
+      <w:pPr>
+        <w:pStyle w:val="Normal"/>
+        <w:bidi w:val="0"/>
+        <w:jc w:val="start"/>
+        <w:rPr>
+          <w:rFonts w:ascii="Liberation Serif" w:hAnsi="Liberation Serif"/>
+          <w:b w:val="false"/>
+          <w:bCs w:val="false"/>
+          <w:i w:val="false"/>
+          <w:caps w:val="false"/>
+          <w:smallCaps w:val="false"/>
+          <w:color w:val="000000"/>
+          <w:spacing w:val="0"/>
+          <w:sz w:val="20"/>
+          <w:szCs w:val="20"/>
+        </w:rPr>
+      </w:pPr>
+      <w:r>
+        <w:rPr>
+          <w:b w:val="false"/>
+          <w:bCs w:val="false"/>
+          <w:i w:val="false"/>
+          <w:caps w:val="false"/>
+          <w:smallCaps w:val="false"/>
+          <w:color w:val="000000"/>
+          <w:spacing w:val="0"/>
+          <w:sz w:val="20"/>
+          <w:szCs w:val="20"/>
+        </w:rPr>
       </w:r>
     </w:p>
     <w:sectPr>
@@ -757,6 +1042,7 @@
       <w:pgNumType w:fmt="decimal"/>
       <w:formProt w:val="false"/>
       <w:textDirection w:val="lrTb"/>
+      <w:docGrid w:type="default" w:linePitch="100" w:charSpace="0"/>
     </w:sectPr>
   </w:body>
 </w:document>
@@ -904,6 +1190,143 @@
   <w:abstractNum w:abstractNumId="2">
     <w:lvl w:ilvl="0">
       <w:start w:val="1"/>
+      <w:numFmt w:val="bullet"/>
+      <w:lvlText w:val=""/>
+      <w:lvlJc w:val="start"/>
+      <w:pPr>
+        <w:tabs>
+          <w:tab w:val="num" w:pos="720"/>
+        </w:tabs>
+        <w:ind w:start="720" w:hanging="360"/>
+      </w:pPr>
+      <w:rPr>
+        <w:rFonts w:ascii="Symbol" w:hAnsi="Symbol" w:cs="Symbol" w:hint="default"/>
+      </w:rPr>
+    </w:lvl>
+    <w:lvl w:ilvl="1">
+      <w:start w:val="1"/>
+      <w:numFmt w:val="bullet"/>
+      <w:lvlText w:val="◦"/>
+      <w:lvlJc w:val="start"/>
+      <w:pPr>
+        <w:tabs>
+          <w:tab w:val="num" w:pos="1080"/>
+        </w:tabs>
+        <w:ind w:start="1080" w:hanging="360"/>
+      </w:pPr>
+      <w:rPr>
+        <w:rFonts w:ascii="OpenSymbol" w:hAnsi="OpenSymbol" w:cs="OpenSymbol" w:hint="default"/>
+      </w:rPr>
+    </w:lvl>
+    <w:lvl w:ilvl="2">
+      <w:start w:val="1"/>
+      <w:numFmt w:val="bullet"/>
+      <w:lvlText w:val="▪"/>
+      <w:lvlJc w:val="start"/>
+      <w:pPr>
+        <w:tabs>
+          <w:tab w:val="num" w:pos="1440"/>
+        </w:tabs>
+        <w:ind w:start="1440" w:hanging="360"/>
+      </w:pPr>
+      <w:rPr>
+        <w:rFonts w:ascii="OpenSymbol" w:hAnsi="OpenSymbol" w:cs="OpenSymbol" w:hint="default"/>
+      </w:rPr>
+    </w:lvl>
+    <w:lvl w:ilvl="3">
+      <w:start w:val="1"/>
+      <w:numFmt w:val="bullet"/>
+      <w:lvlText w:val=""/>
+      <w:lvlJc w:val="start"/>
+      <w:pPr>
+        <w:tabs>
+          <w:tab w:val="num" w:pos="1800"/>
+        </w:tabs>
+        <w:ind w:start="1800" w:hanging="360"/>
+      </w:pPr>
+      <w:rPr>
+        <w:rFonts w:ascii="Symbol" w:hAnsi="Symbol" w:cs="Symbol" w:hint="default"/>
+      </w:rPr>
+    </w:lvl>
+    <w:lvl w:ilvl="4">
+      <w:start w:val="1"/>
+      <w:numFmt w:val="bullet"/>
+      <w:lvlText w:val="◦"/>
+      <w:lvlJc w:val="start"/>
+      <w:pPr>
+        <w:tabs>
+          <w:tab w:val="num" w:pos="2160"/>
+        </w:tabs>
+        <w:ind w:start="2160" w:hanging="360"/>
+      </w:pPr>
+      <w:rPr>
+        <w:rFonts w:ascii="OpenSymbol" w:hAnsi="OpenSymbol" w:cs="OpenSymbol" w:hint="default"/>
+      </w:rPr>
+    </w:lvl>
+    <w:lvl w:ilvl="5">
+      <w:start w:val="1"/>
+      <w:numFmt w:val="bullet"/>
+      <w:lvlText w:val="▪"/>
+      <w:lvlJc w:val="start"/>
+      <w:pPr>
+        <w:tabs>
+          <w:tab w:val="num" w:pos="2520"/>
+        </w:tabs>
+        <w:ind w:start="2520" w:hanging="360"/>
+      </w:pPr>
+      <w:rPr>
+        <w:rFonts w:ascii="OpenSymbol" w:hAnsi="OpenSymbol" w:cs="OpenSymbol" w:hint="default"/>
+      </w:rPr>
+    </w:lvl>
+    <w:lvl w:ilvl="6">
+      <w:start w:val="1"/>
+      <w:numFmt w:val="bullet"/>
+      <w:lvlText w:val=""/>
+      <w:lvlJc w:val="start"/>
+      <w:pPr>
+        <w:tabs>
+          <w:tab w:val="num" w:pos="2880"/>
+        </w:tabs>
+        <w:ind w:start="2880" w:hanging="360"/>
+      </w:pPr>
+      <w:rPr>
+        <w:rFonts w:ascii="Symbol" w:hAnsi="Symbol" w:cs="Symbol" w:hint="default"/>
+      </w:rPr>
+    </w:lvl>
+    <w:lvl w:ilvl="7">
+      <w:start w:val="1"/>
+      <w:numFmt w:val="bullet"/>
+      <w:lvlText w:val="◦"/>
+      <w:lvlJc w:val="start"/>
+      <w:pPr>
+        <w:tabs>
+          <w:tab w:val="num" w:pos="3240"/>
+        </w:tabs>
+        <w:ind w:start="3240" w:hanging="360"/>
+      </w:pPr>
+      <w:rPr>
+        <w:rFonts w:ascii="OpenSymbol" w:hAnsi="OpenSymbol" w:cs="OpenSymbol" w:hint="default"/>
+      </w:rPr>
+    </w:lvl>
+    <w:lvl w:ilvl="8">
+      <w:start w:val="1"/>
+      <w:numFmt w:val="bullet"/>
+      <w:lvlText w:val="▪"/>
+      <w:lvlJc w:val="start"/>
+      <w:pPr>
+        <w:tabs>
+          <w:tab w:val="num" w:pos="3600"/>
+        </w:tabs>
+        <w:ind w:start="3600" w:hanging="360"/>
+      </w:pPr>
+      <w:rPr>
+        <w:rFonts w:ascii="OpenSymbol" w:hAnsi="OpenSymbol" w:cs="OpenSymbol" w:hint="default"/>
+      </w:rPr>
+    </w:lvl>
+  </w:abstractNum>
+  <w:abstractNum w:abstractNumId="3">
+    <w:lvl w:ilvl="0">
+      <w:start w:val="1"/>
       <w:numFmt w:val="none"/>
       <w:suff w:val="nothing"/>
       <w:lvlText w:val=""/>
@@ -1025,6 +1448,9 @@
   </w:num>
   <w:num w:numId="2">
     <w:abstractNumId w:val="2"/>
+  </w:num>
+  <w:num w:numId="3">
+    <w:abstractNumId w:val="3"/>
   </w:num>
 </w:numbering>
 </file>
@@ -1043,7 +1469,6 @@
     </w:rPrDefault>
     <w:pPrDefault>
       <w:pPr>
-        <w:widowControl/>
         <w:suppressAutoHyphens w:val="true"/>
       </w:pPr>
     </w:pPrDefault>
@@ -1053,7 +1478,10 @@
     <w:qFormat/>
     <w:pPr>
       <w:widowControl/>
+      <w:suppressAutoHyphens w:val="true"/>
       <w:bidi w:val="0"/>
+      <w:spacing w:before="0" w:after="0"/>
+      <w:jc w:val="start"/>
     </w:pPr>
     <w:rPr>
       <w:rFonts w:ascii="Liberation Serif" w:hAnsi="Liberation Serif" w:eastAsia="Noto Serif CJK SC" w:cs="Noto Sans Devanagari"/>
@@ -1062,6 +1490,13 @@
       <w:sz w:val="24"/>
       <w:szCs w:val="24"/>
       <w:lang w:val="en-GB" w:eastAsia="zh-CN" w:bidi="hi-IN"/>
+    </w:rPr>
+  </w:style>
+  <w:style w:type="character" w:styleId="Bulletsuser">
+    <w:name w:val="Bullets (user)"/>
+    <w:qFormat/>
+    <w:rPr>
+      <w:rFonts w:ascii="OpenSymbol" w:hAnsi="OpenSymbol" w:eastAsia="OpenSymbol" w:cs="OpenSymbol"/>
     </w:rPr>
   </w:style>
   <w:style w:type="character" w:styleId="Bullets">

</xml_diff>

<commit_message>
design spec fully done
</commit_message>
<xml_diff>
--- a/40482879 (Jack)/40482879_Design_Spec.docx
+++ b/40482879 (Jack)/40482879_Design_Spec.docx
@@ -994,29 +994,15 @@
         </w:rPr>
       </w:pPr>
       <w:r>
-        <w:rPr>
-          <w:b w:val="false"/>
-          <w:bCs w:val="false"/>
-          <w:i w:val="false"/>
-          <w:caps w:val="false"/>
-          <w:smallCaps w:val="false"/>
-          <w:color w:val="000000"/>
-          <w:spacing w:val="0"/>
-          <w:sz w:val="20"/>
-          <w:szCs w:val="20"/>
-        </w:rPr>
+        <w:rPr/>
+        <w:t xml:space="preserve">            </w:t>
+      </w:r>
+      <w:r>
+        <w:rPr/>
         <w:drawing>
-          <wp:anchor distT="0" distB="0" distL="0" distR="0" simplePos="0" relativeHeight="2" behindDoc="0" locked="0" layoutInCell="0" allowOverlap="1">
-            <wp:simplePos x="0" y="0"/>
-            <wp:positionH relativeFrom="column">
-              <wp:align>center</wp:align>
-            </wp:positionH>
-            <wp:positionV relativeFrom="paragraph">
-              <wp:posOffset>635</wp:posOffset>
-            </wp:positionV>
+          <wp:inline distT="0" distB="0" distL="0" distR="0">
             <wp:extent cx="4994275" cy="3904615"/>
             <wp:effectExtent l="0" t="0" r="0" b="0"/>
-            <wp:wrapSquare wrapText="largest"/>
             <wp:docPr id="1" name="Image1"/>
             <wp:cNvGraphicFramePr>
               <a:graphicFrameLocks xmlns:a="http://schemas.openxmlformats.org/drawingml/2006/main" noChangeAspect="1"/>
@@ -1049,8 +1035,616 @@
                 </pic:pic>
               </a:graphicData>
             </a:graphic>
-          </wp:anchor>
+          </wp:inline>
         </w:drawing>
+      </w:r>
+    </w:p>
+    <w:p>
+      <w:pPr>
+        <w:pStyle w:val="Normal"/>
+        <w:bidi w:val="0"/>
+        <w:jc w:val="start"/>
+        <w:rPr>
+          <w:rFonts w:ascii="Liberation Serif" w:hAnsi="Liberation Serif"/>
+          <w:b w:val="false"/>
+          <w:bCs w:val="false"/>
+          <w:i w:val="false"/>
+          <w:caps w:val="false"/>
+          <w:smallCaps w:val="false"/>
+          <w:color w:val="000000"/>
+          <w:spacing w:val="0"/>
+          <w:sz w:val="20"/>
+          <w:szCs w:val="20"/>
+        </w:rPr>
+      </w:pPr>
+      <w:r>
+        <w:rPr>
+          <w:b w:val="false"/>
+          <w:bCs w:val="false"/>
+          <w:i w:val="false"/>
+          <w:caps w:val="false"/>
+          <w:smallCaps w:val="false"/>
+          <w:color w:val="000000"/>
+          <w:spacing w:val="0"/>
+          <w:sz w:val="20"/>
+          <w:szCs w:val="20"/>
+        </w:rPr>
+      </w:r>
+    </w:p>
+    <w:p>
+      <w:pPr>
+        <w:pStyle w:val="Normal"/>
+        <w:bidi w:val="0"/>
+        <w:jc w:val="start"/>
+        <w:rPr>
+          <w:rFonts w:ascii="Liberation Serif" w:hAnsi="Liberation Serif"/>
+          <w:b/>
+          <w:bCs/>
+          <w:i w:val="false"/>
+          <w:caps w:val="false"/>
+          <w:smallCaps w:val="false"/>
+          <w:color w:val="000000"/>
+          <w:spacing w:val="0"/>
+          <w:sz w:val="28"/>
+          <w:szCs w:val="28"/>
+        </w:rPr>
+      </w:pPr>
+      <w:r>
+        <w:rPr>
+          <w:b/>
+          <w:bCs/>
+          <w:i w:val="false"/>
+          <w:caps w:val="false"/>
+          <w:smallCaps w:val="false"/>
+          <w:color w:val="000000"/>
+          <w:spacing w:val="0"/>
+          <w:sz w:val="28"/>
+          <w:szCs w:val="28"/>
+        </w:rPr>
+        <w:t>Key CRUD functionality:</w:t>
+      </w:r>
+    </w:p>
+    <w:p>
+      <w:pPr>
+        <w:pStyle w:val="Normal"/>
+        <w:bidi w:val="0"/>
+        <w:jc w:val="start"/>
+        <w:rPr>
+          <w:rFonts w:ascii="Liberation Serif" w:hAnsi="Liberation Serif"/>
+          <w:b/>
+          <w:bCs/>
+          <w:i w:val="false"/>
+          <w:caps w:val="false"/>
+          <w:smallCaps w:val="false"/>
+          <w:color w:val="000000"/>
+          <w:spacing w:val="0"/>
+          <w:sz w:val="28"/>
+          <w:szCs w:val="28"/>
+        </w:rPr>
+      </w:pPr>
+      <w:r>
+        <w:rPr>
+          <w:b/>
+          <w:bCs/>
+          <w:i w:val="false"/>
+          <w:caps w:val="false"/>
+          <w:smallCaps w:val="false"/>
+          <w:color w:val="000000"/>
+          <w:spacing w:val="0"/>
+          <w:sz w:val="28"/>
+          <w:szCs w:val="28"/>
+        </w:rPr>
+        <w:t>Create</w:t>
+      </w:r>
+    </w:p>
+    <w:p>
+      <w:pPr>
+        <w:pStyle w:val="Normal"/>
+        <w:numPr>
+          <w:ilvl w:val="0"/>
+          <w:numId w:val="3"/>
+        </w:numPr>
+        <w:bidi w:val="0"/>
+        <w:jc w:val="start"/>
+        <w:rPr>
+          <w:rFonts w:ascii="Liberation Serif" w:hAnsi="Liberation Serif"/>
+          <w:b w:val="false"/>
+          <w:bCs w:val="false"/>
+          <w:i w:val="false"/>
+          <w:caps w:val="false"/>
+          <w:smallCaps w:val="false"/>
+          <w:color w:val="000000"/>
+          <w:spacing w:val="0"/>
+          <w:sz w:val="20"/>
+          <w:szCs w:val="20"/>
+        </w:rPr>
+      </w:pPr>
+      <w:r>
+        <w:rPr>
+          <w:b w:val="false"/>
+          <w:bCs w:val="false"/>
+          <w:i w:val="false"/>
+          <w:caps w:val="false"/>
+          <w:smallCaps w:val="false"/>
+          <w:color w:val="000000"/>
+          <w:spacing w:val="0"/>
+          <w:sz w:val="20"/>
+          <w:szCs w:val="20"/>
+        </w:rPr>
+        <w:t>Add student and there details such as Name and DOB to the system</w:t>
+      </w:r>
+    </w:p>
+    <w:p>
+      <w:pPr>
+        <w:pStyle w:val="Normal"/>
+        <w:numPr>
+          <w:ilvl w:val="0"/>
+          <w:numId w:val="3"/>
+        </w:numPr>
+        <w:bidi w:val="0"/>
+        <w:jc w:val="start"/>
+        <w:rPr>
+          <w:rFonts w:ascii="Liberation Serif" w:hAnsi="Liberation Serif"/>
+          <w:b w:val="false"/>
+          <w:bCs w:val="false"/>
+          <w:i w:val="false"/>
+          <w:caps w:val="false"/>
+          <w:smallCaps w:val="false"/>
+          <w:color w:val="000000"/>
+          <w:spacing w:val="0"/>
+          <w:sz w:val="20"/>
+          <w:szCs w:val="20"/>
+        </w:rPr>
+      </w:pPr>
+      <w:r>
+        <w:rPr>
+          <w:b w:val="false"/>
+          <w:bCs w:val="false"/>
+          <w:i w:val="false"/>
+          <w:caps w:val="false"/>
+          <w:smallCaps w:val="false"/>
+          <w:color w:val="000000"/>
+          <w:spacing w:val="0"/>
+          <w:sz w:val="20"/>
+          <w:szCs w:val="20"/>
+        </w:rPr>
+        <w:t>Allow adding disabilities and assistance to be added to a student</w:t>
+      </w:r>
+    </w:p>
+    <w:p>
+      <w:pPr>
+        <w:pStyle w:val="Normal"/>
+        <w:numPr>
+          <w:ilvl w:val="0"/>
+          <w:numId w:val="3"/>
+        </w:numPr>
+        <w:bidi w:val="0"/>
+        <w:jc w:val="start"/>
+        <w:rPr>
+          <w:rFonts w:ascii="Liberation Serif" w:hAnsi="Liberation Serif"/>
+          <w:b w:val="false"/>
+          <w:bCs w:val="false"/>
+          <w:i w:val="false"/>
+          <w:caps w:val="false"/>
+          <w:smallCaps w:val="false"/>
+          <w:color w:val="000000"/>
+          <w:spacing w:val="0"/>
+          <w:sz w:val="20"/>
+          <w:szCs w:val="20"/>
+        </w:rPr>
+      </w:pPr>
+      <w:r>
+        <w:rPr>
+          <w:b w:val="false"/>
+          <w:bCs w:val="false"/>
+          <w:i w:val="false"/>
+          <w:caps w:val="false"/>
+          <w:smallCaps w:val="false"/>
+          <w:color w:val="000000"/>
+          <w:spacing w:val="0"/>
+          <w:sz w:val="20"/>
+          <w:szCs w:val="20"/>
+        </w:rPr>
+        <w:t>The ability to add test results to a student</w:t>
+      </w:r>
+    </w:p>
+    <w:p>
+      <w:pPr>
+        <w:pStyle w:val="Normal"/>
+        <w:bidi w:val="0"/>
+        <w:jc w:val="start"/>
+        <w:rPr>
+          <w:rFonts w:ascii="Liberation Serif" w:hAnsi="Liberation Serif"/>
+          <w:b/>
+          <w:bCs/>
+          <w:i w:val="false"/>
+          <w:caps w:val="false"/>
+          <w:smallCaps w:val="false"/>
+          <w:color w:val="000000"/>
+          <w:spacing w:val="0"/>
+          <w:sz w:val="28"/>
+          <w:szCs w:val="28"/>
+        </w:rPr>
+      </w:pPr>
+      <w:r>
+        <w:rPr>
+          <w:b/>
+          <w:bCs/>
+          <w:i w:val="false"/>
+          <w:caps w:val="false"/>
+          <w:smallCaps w:val="false"/>
+          <w:color w:val="000000"/>
+          <w:spacing w:val="0"/>
+          <w:sz w:val="28"/>
+          <w:szCs w:val="28"/>
+        </w:rPr>
+        <w:t>Edit</w:t>
+      </w:r>
+    </w:p>
+    <w:p>
+      <w:pPr>
+        <w:pStyle w:val="Normal"/>
+        <w:numPr>
+          <w:ilvl w:val="0"/>
+          <w:numId w:val="4"/>
+        </w:numPr>
+        <w:bidi w:val="0"/>
+        <w:jc w:val="start"/>
+        <w:rPr>
+          <w:rFonts w:ascii="Liberation Serif" w:hAnsi="Liberation Serif"/>
+          <w:b w:val="false"/>
+          <w:bCs w:val="false"/>
+          <w:i w:val="false"/>
+          <w:caps w:val="false"/>
+          <w:smallCaps w:val="false"/>
+          <w:color w:val="000000"/>
+          <w:spacing w:val="0"/>
+          <w:sz w:val="20"/>
+          <w:szCs w:val="20"/>
+        </w:rPr>
+      </w:pPr>
+      <w:r>
+        <w:rPr>
+          <w:b w:val="false"/>
+          <w:bCs w:val="false"/>
+          <w:i w:val="false"/>
+          <w:caps w:val="false"/>
+          <w:smallCaps w:val="false"/>
+          <w:color w:val="000000"/>
+          <w:spacing w:val="0"/>
+          <w:sz w:val="20"/>
+          <w:szCs w:val="20"/>
+        </w:rPr>
+        <w:t>Allow to edit a students details</w:t>
+      </w:r>
+    </w:p>
+    <w:p>
+      <w:pPr>
+        <w:pStyle w:val="Normal"/>
+        <w:numPr>
+          <w:ilvl w:val="0"/>
+          <w:numId w:val="4"/>
+        </w:numPr>
+        <w:bidi w:val="0"/>
+        <w:jc w:val="start"/>
+        <w:rPr>
+          <w:rFonts w:ascii="Liberation Serif" w:hAnsi="Liberation Serif"/>
+          <w:b w:val="false"/>
+          <w:bCs w:val="false"/>
+          <w:i w:val="false"/>
+          <w:caps w:val="false"/>
+          <w:smallCaps w:val="false"/>
+          <w:color w:val="000000"/>
+          <w:spacing w:val="0"/>
+          <w:sz w:val="20"/>
+          <w:szCs w:val="20"/>
+        </w:rPr>
+      </w:pPr>
+      <w:r>
+        <w:rPr>
+          <w:b w:val="false"/>
+          <w:bCs w:val="false"/>
+          <w:i w:val="false"/>
+          <w:caps w:val="false"/>
+          <w:smallCaps w:val="false"/>
+          <w:color w:val="000000"/>
+          <w:spacing w:val="0"/>
+          <w:sz w:val="20"/>
+          <w:szCs w:val="20"/>
+        </w:rPr>
+        <w:t>Edit a students assistance</w:t>
+      </w:r>
+    </w:p>
+    <w:p>
+      <w:pPr>
+        <w:pStyle w:val="Normal"/>
+        <w:bidi w:val="0"/>
+        <w:jc w:val="start"/>
+        <w:rPr>
+          <w:rFonts w:ascii="Liberation Serif" w:hAnsi="Liberation Serif"/>
+          <w:b/>
+          <w:bCs/>
+          <w:i w:val="false"/>
+          <w:caps w:val="false"/>
+          <w:smallCaps w:val="false"/>
+          <w:color w:val="000000"/>
+          <w:spacing w:val="0"/>
+          <w:sz w:val="28"/>
+          <w:szCs w:val="28"/>
+        </w:rPr>
+      </w:pPr>
+      <w:r>
+        <w:rPr>
+          <w:b/>
+          <w:bCs/>
+          <w:i w:val="false"/>
+          <w:caps w:val="false"/>
+          <w:smallCaps w:val="false"/>
+          <w:color w:val="000000"/>
+          <w:spacing w:val="0"/>
+          <w:sz w:val="28"/>
+          <w:szCs w:val="28"/>
+        </w:rPr>
+        <w:t>Delete</w:t>
+      </w:r>
+    </w:p>
+    <w:p>
+      <w:pPr>
+        <w:pStyle w:val="Normal"/>
+        <w:numPr>
+          <w:ilvl w:val="0"/>
+          <w:numId w:val="5"/>
+        </w:numPr>
+        <w:bidi w:val="0"/>
+        <w:jc w:val="start"/>
+        <w:rPr>
+          <w:rFonts w:ascii="Liberation Serif" w:hAnsi="Liberation Serif"/>
+          <w:b w:val="false"/>
+          <w:bCs w:val="false"/>
+          <w:i w:val="false"/>
+          <w:caps w:val="false"/>
+          <w:smallCaps w:val="false"/>
+          <w:color w:val="000000"/>
+          <w:spacing w:val="0"/>
+          <w:sz w:val="20"/>
+          <w:szCs w:val="20"/>
+        </w:rPr>
+      </w:pPr>
+      <w:r>
+        <w:rPr>
+          <w:b w:val="false"/>
+          <w:bCs w:val="false"/>
+          <w:i w:val="false"/>
+          <w:caps w:val="false"/>
+          <w:smallCaps w:val="false"/>
+          <w:color w:val="000000"/>
+          <w:spacing w:val="0"/>
+          <w:sz w:val="20"/>
+          <w:szCs w:val="20"/>
+        </w:rPr>
+        <w:t xml:space="preserve">The ability to delete the </w:t>
+      </w:r>
+      <w:r>
+        <w:rPr>
+          <w:b w:val="false"/>
+          <w:bCs w:val="false"/>
+          <w:i w:val="false"/>
+          <w:caps w:val="false"/>
+          <w:smallCaps w:val="false"/>
+          <w:color w:val="000000"/>
+          <w:spacing w:val="0"/>
+          <w:sz w:val="20"/>
+          <w:szCs w:val="20"/>
+        </w:rPr>
+        <w:t>a student from the system</w:t>
+      </w:r>
+    </w:p>
+    <w:p>
+      <w:pPr>
+        <w:pStyle w:val="Normal"/>
+        <w:numPr>
+          <w:ilvl w:val="0"/>
+          <w:numId w:val="5"/>
+        </w:numPr>
+        <w:bidi w:val="0"/>
+        <w:jc w:val="start"/>
+        <w:rPr>
+          <w:rFonts w:ascii="Liberation Serif" w:hAnsi="Liberation Serif"/>
+          <w:b w:val="false"/>
+          <w:bCs w:val="false"/>
+          <w:i w:val="false"/>
+          <w:caps w:val="false"/>
+          <w:smallCaps w:val="false"/>
+          <w:color w:val="000000"/>
+          <w:spacing w:val="0"/>
+          <w:sz w:val="20"/>
+          <w:szCs w:val="20"/>
+        </w:rPr>
+      </w:pPr>
+      <w:r>
+        <w:rPr>
+          <w:b w:val="false"/>
+          <w:bCs w:val="false"/>
+          <w:i w:val="false"/>
+          <w:caps w:val="false"/>
+          <w:smallCaps w:val="false"/>
+          <w:color w:val="000000"/>
+          <w:spacing w:val="0"/>
+          <w:sz w:val="20"/>
+          <w:szCs w:val="20"/>
+        </w:rPr>
+        <w:t>Delete a test result of a student from the Student_Test records</w:t>
+      </w:r>
+    </w:p>
+    <w:p>
+      <w:pPr>
+        <w:pStyle w:val="Normal"/>
+        <w:bidi w:val="0"/>
+        <w:jc w:val="start"/>
+        <w:rPr>
+          <w:rFonts w:ascii="Liberation Serif" w:hAnsi="Liberation Serif"/>
+          <w:b w:val="false"/>
+          <w:bCs w:val="false"/>
+          <w:i w:val="false"/>
+          <w:caps w:val="false"/>
+          <w:smallCaps w:val="false"/>
+          <w:color w:val="000000"/>
+          <w:spacing w:val="0"/>
+          <w:sz w:val="20"/>
+          <w:szCs w:val="20"/>
+        </w:rPr>
+      </w:pPr>
+      <w:r>
+        <w:rPr>
+          <w:b w:val="false"/>
+          <w:bCs w:val="false"/>
+          <w:i w:val="false"/>
+          <w:caps w:val="false"/>
+          <w:smallCaps w:val="false"/>
+          <w:color w:val="000000"/>
+          <w:spacing w:val="0"/>
+          <w:sz w:val="20"/>
+          <w:szCs w:val="20"/>
+        </w:rPr>
+      </w:r>
+    </w:p>
+    <w:p>
+      <w:pPr>
+        <w:pStyle w:val="Heading1"/>
+        <w:rPr>
+          <w:rFonts w:ascii="Liberation Serif" w:hAnsi="Liberation Serif"/>
+          <w:b/>
+          <w:bCs/>
+          <w:color w:val="000000"/>
+          <w:sz w:val="28"/>
+          <w:szCs w:val="28"/>
+        </w:rPr>
+      </w:pPr>
+      <w:r>
+        <w:rPr>
+          <w:rFonts w:ascii="Liberation Serif" w:hAnsi="Liberation Serif"/>
+          <w:b/>
+          <w:bCs/>
+          <w:color w:val="000000"/>
+          <w:sz w:val="28"/>
+          <w:szCs w:val="28"/>
+        </w:rPr>
+        <w:t>Data Integrity and Security Considerations</w:t>
+      </w:r>
+    </w:p>
+    <w:p>
+      <w:pPr>
+        <w:pStyle w:val="ListParagraph"/>
+        <w:numPr>
+          <w:ilvl w:val="0"/>
+          <w:numId w:val="2"/>
+        </w:numPr>
+        <w:rPr>
+          <w:sz w:val="20"/>
+          <w:szCs w:val="20"/>
+        </w:rPr>
+      </w:pPr>
+      <w:r>
+        <w:rPr>
+          <w:sz w:val="20"/>
+          <w:szCs w:val="20"/>
+        </w:rPr>
+        <w:t>NOT NULL constraints on identifying fields (names, DOB) and on all foreign keys in linking tables</w:t>
+      </w:r>
+    </w:p>
+    <w:p>
+      <w:pPr>
+        <w:pStyle w:val="ListParagraph"/>
+        <w:numPr>
+          <w:ilvl w:val="0"/>
+          <w:numId w:val="2"/>
+        </w:numPr>
+        <w:rPr>
+          <w:sz w:val="20"/>
+          <w:szCs w:val="20"/>
+        </w:rPr>
+      </w:pPr>
+      <w:r>
+        <w:rPr>
+          <w:sz w:val="20"/>
+          <w:szCs w:val="20"/>
+        </w:rPr>
+        <w:t xml:space="preserve">Composite primary keys on linking tables (e.g. </w:t>
+      </w:r>
+      <w:r>
+        <w:rPr>
+          <w:sz w:val="20"/>
+          <w:szCs w:val="20"/>
+        </w:rPr>
+        <w:t xml:space="preserve">Test_Class_Subject </w:t>
+      </w:r>
+      <w:r>
+        <w:rPr>
+          <w:sz w:val="20"/>
+          <w:szCs w:val="20"/>
+        </w:rPr>
+        <w:t>uses all three foreign keys) to prevent duplicate support records</w:t>
+      </w:r>
+    </w:p>
+    <w:p>
+      <w:pPr>
+        <w:pStyle w:val="ListParagraph"/>
+        <w:numPr>
+          <w:ilvl w:val="0"/>
+          <w:numId w:val="2"/>
+        </w:numPr>
+        <w:rPr>
+          <w:sz w:val="20"/>
+          <w:szCs w:val="20"/>
+        </w:rPr>
+      </w:pPr>
+      <w:r>
+        <w:rPr>
+          <w:sz w:val="20"/>
+          <w:szCs w:val="20"/>
+        </w:rPr>
+        <w:t xml:space="preserve">Foreign key constraints to maintain referential integrity — for example, a Test cannot reference a non-existent Subject </w:t>
+      </w:r>
+      <w:r>
+        <w:rPr>
+          <w:sz w:val="20"/>
+          <w:szCs w:val="20"/>
+        </w:rPr>
+        <w:t>ID</w:t>
+      </w:r>
+    </w:p>
+    <w:p>
+      <w:pPr>
+        <w:pStyle w:val="ListParagraph"/>
+        <w:numPr>
+          <w:ilvl w:val="0"/>
+          <w:numId w:val="2"/>
+        </w:numPr>
+        <w:rPr>
+          <w:sz w:val="20"/>
+          <w:szCs w:val="20"/>
+        </w:rPr>
+      </w:pPr>
+      <w:r>
+        <w:rPr>
+          <w:sz w:val="20"/>
+          <w:szCs w:val="20"/>
+        </w:rPr>
+        <w:t xml:space="preserve">Client-side validation aligned with database constraints </w:t>
+      </w:r>
+      <w:r>
+        <w:rPr>
+          <w:sz w:val="20"/>
+          <w:szCs w:val="20"/>
+        </w:rPr>
+        <w:t>(</w:t>
+      </w:r>
+      <w:r>
+        <w:rPr>
+          <w:sz w:val="20"/>
+          <w:szCs w:val="20"/>
+        </w:rPr>
+        <w:t>valid date ranges)</w:t>
       </w:r>
     </w:p>
     <w:sectPr>
@@ -1345,6 +1939,417 @@
   <w:abstractNum w:abstractNumId="3">
     <w:lvl w:ilvl="0">
       <w:start w:val="1"/>
+      <w:numFmt w:val="bullet"/>
+      <w:lvlText w:val=""/>
+      <w:lvlJc w:val="start"/>
+      <w:pPr>
+        <w:tabs>
+          <w:tab w:val="num" w:pos="720"/>
+        </w:tabs>
+        <w:ind w:start="720" w:hanging="360"/>
+      </w:pPr>
+      <w:rPr>
+        <w:rFonts w:ascii="Symbol" w:hAnsi="Symbol" w:cs="Symbol" w:hint="default"/>
+      </w:rPr>
+    </w:lvl>
+    <w:lvl w:ilvl="1">
+      <w:start w:val="1"/>
+      <w:numFmt w:val="bullet"/>
+      <w:lvlText w:val="◦"/>
+      <w:lvlJc w:val="start"/>
+      <w:pPr>
+        <w:tabs>
+          <w:tab w:val="num" w:pos="1080"/>
+        </w:tabs>
+        <w:ind w:start="1080" w:hanging="360"/>
+      </w:pPr>
+      <w:rPr>
+        <w:rFonts w:ascii="OpenSymbol" w:hAnsi="OpenSymbol" w:cs="OpenSymbol" w:hint="default"/>
+      </w:rPr>
+    </w:lvl>
+    <w:lvl w:ilvl="2">
+      <w:start w:val="1"/>
+      <w:numFmt w:val="bullet"/>
+      <w:lvlText w:val="▪"/>
+      <w:lvlJc w:val="start"/>
+      <w:pPr>
+        <w:tabs>
+          <w:tab w:val="num" w:pos="1440"/>
+        </w:tabs>
+        <w:ind w:start="1440" w:hanging="360"/>
+      </w:pPr>
+      <w:rPr>
+        <w:rFonts w:ascii="OpenSymbol" w:hAnsi="OpenSymbol" w:cs="OpenSymbol" w:hint="default"/>
+      </w:rPr>
+    </w:lvl>
+    <w:lvl w:ilvl="3">
+      <w:start w:val="1"/>
+      <w:numFmt w:val="bullet"/>
+      <w:lvlText w:val=""/>
+      <w:lvlJc w:val="start"/>
+      <w:pPr>
+        <w:tabs>
+          <w:tab w:val="num" w:pos="1800"/>
+        </w:tabs>
+        <w:ind w:start="1800" w:hanging="360"/>
+      </w:pPr>
+      <w:rPr>
+        <w:rFonts w:ascii="Symbol" w:hAnsi="Symbol" w:cs="Symbol" w:hint="default"/>
+      </w:rPr>
+    </w:lvl>
+    <w:lvl w:ilvl="4">
+      <w:start w:val="1"/>
+      <w:numFmt w:val="bullet"/>
+      <w:lvlText w:val="◦"/>
+      <w:lvlJc w:val="start"/>
+      <w:pPr>
+        <w:tabs>
+          <w:tab w:val="num" w:pos="2160"/>
+        </w:tabs>
+        <w:ind w:start="2160" w:hanging="360"/>
+      </w:pPr>
+      <w:rPr>
+        <w:rFonts w:ascii="OpenSymbol" w:hAnsi="OpenSymbol" w:cs="OpenSymbol" w:hint="default"/>
+      </w:rPr>
+    </w:lvl>
+    <w:lvl w:ilvl="5">
+      <w:start w:val="1"/>
+      <w:numFmt w:val="bullet"/>
+      <w:lvlText w:val="▪"/>
+      <w:lvlJc w:val="start"/>
+      <w:pPr>
+        <w:tabs>
+          <w:tab w:val="num" w:pos="2520"/>
+        </w:tabs>
+        <w:ind w:start="2520" w:hanging="360"/>
+      </w:pPr>
+      <w:rPr>
+        <w:rFonts w:ascii="OpenSymbol" w:hAnsi="OpenSymbol" w:cs="OpenSymbol" w:hint="default"/>
+      </w:rPr>
+    </w:lvl>
+    <w:lvl w:ilvl="6">
+      <w:start w:val="1"/>
+      <w:numFmt w:val="bullet"/>
+      <w:lvlText w:val=""/>
+      <w:lvlJc w:val="start"/>
+      <w:pPr>
+        <w:tabs>
+          <w:tab w:val="num" w:pos="2880"/>
+        </w:tabs>
+        <w:ind w:start="2880" w:hanging="360"/>
+      </w:pPr>
+      <w:rPr>
+        <w:rFonts w:ascii="Symbol" w:hAnsi="Symbol" w:cs="Symbol" w:hint="default"/>
+      </w:rPr>
+    </w:lvl>
+    <w:lvl w:ilvl="7">
+      <w:start w:val="1"/>
+      <w:numFmt w:val="bullet"/>
+      <w:lvlText w:val="◦"/>
+      <w:lvlJc w:val="start"/>
+      <w:pPr>
+        <w:tabs>
+          <w:tab w:val="num" w:pos="3240"/>
+        </w:tabs>
+        <w:ind w:start="3240" w:hanging="360"/>
+      </w:pPr>
+      <w:rPr>
+        <w:rFonts w:ascii="OpenSymbol" w:hAnsi="OpenSymbol" w:cs="OpenSymbol" w:hint="default"/>
+      </w:rPr>
+    </w:lvl>
+    <w:lvl w:ilvl="8">
+      <w:start w:val="1"/>
+      <w:numFmt w:val="bullet"/>
+      <w:lvlText w:val="▪"/>
+      <w:lvlJc w:val="start"/>
+      <w:pPr>
+        <w:tabs>
+          <w:tab w:val="num" w:pos="3600"/>
+        </w:tabs>
+        <w:ind w:start="3600" w:hanging="360"/>
+      </w:pPr>
+      <w:rPr>
+        <w:rFonts w:ascii="OpenSymbol" w:hAnsi="OpenSymbol" w:cs="OpenSymbol" w:hint="default"/>
+      </w:rPr>
+    </w:lvl>
+  </w:abstractNum>
+  <w:abstractNum w:abstractNumId="4">
+    <w:lvl w:ilvl="0">
+      <w:start w:val="1"/>
+      <w:numFmt w:val="bullet"/>
+      <w:lvlText w:val=""/>
+      <w:lvlJc w:val="start"/>
+      <w:pPr>
+        <w:tabs>
+          <w:tab w:val="num" w:pos="720"/>
+        </w:tabs>
+        <w:ind w:start="720" w:hanging="360"/>
+      </w:pPr>
+      <w:rPr>
+        <w:rFonts w:ascii="Symbol" w:hAnsi="Symbol" w:cs="Symbol" w:hint="default"/>
+      </w:rPr>
+    </w:lvl>
+    <w:lvl w:ilvl="1">
+      <w:start w:val="1"/>
+      <w:numFmt w:val="bullet"/>
+      <w:lvlText w:val="◦"/>
+      <w:lvlJc w:val="start"/>
+      <w:pPr>
+        <w:tabs>
+          <w:tab w:val="num" w:pos="1080"/>
+        </w:tabs>
+        <w:ind w:start="1080" w:hanging="360"/>
+      </w:pPr>
+      <w:rPr>
+        <w:rFonts w:ascii="OpenSymbol" w:hAnsi="OpenSymbol" w:cs="OpenSymbol" w:hint="default"/>
+      </w:rPr>
+    </w:lvl>
+    <w:lvl w:ilvl="2">
+      <w:start w:val="1"/>
+      <w:numFmt w:val="bullet"/>
+      <w:lvlText w:val="▪"/>
+      <w:lvlJc w:val="start"/>
+      <w:pPr>
+        <w:tabs>
+          <w:tab w:val="num" w:pos="1440"/>
+        </w:tabs>
+        <w:ind w:start="1440" w:hanging="360"/>
+      </w:pPr>
+      <w:rPr>
+        <w:rFonts w:ascii="OpenSymbol" w:hAnsi="OpenSymbol" w:cs="OpenSymbol" w:hint="default"/>
+      </w:rPr>
+    </w:lvl>
+    <w:lvl w:ilvl="3">
+      <w:start w:val="1"/>
+      <w:numFmt w:val="bullet"/>
+      <w:lvlText w:val=""/>
+      <w:lvlJc w:val="start"/>
+      <w:pPr>
+        <w:tabs>
+          <w:tab w:val="num" w:pos="1800"/>
+        </w:tabs>
+        <w:ind w:start="1800" w:hanging="360"/>
+      </w:pPr>
+      <w:rPr>
+        <w:rFonts w:ascii="Symbol" w:hAnsi="Symbol" w:cs="Symbol" w:hint="default"/>
+      </w:rPr>
+    </w:lvl>
+    <w:lvl w:ilvl="4">
+      <w:start w:val="1"/>
+      <w:numFmt w:val="bullet"/>
+      <w:lvlText w:val="◦"/>
+      <w:lvlJc w:val="start"/>
+      <w:pPr>
+        <w:tabs>
+          <w:tab w:val="num" w:pos="2160"/>
+        </w:tabs>
+        <w:ind w:start="2160" w:hanging="360"/>
+      </w:pPr>
+      <w:rPr>
+        <w:rFonts w:ascii="OpenSymbol" w:hAnsi="OpenSymbol" w:cs="OpenSymbol" w:hint="default"/>
+      </w:rPr>
+    </w:lvl>
+    <w:lvl w:ilvl="5">
+      <w:start w:val="1"/>
+      <w:numFmt w:val="bullet"/>
+      <w:lvlText w:val="▪"/>
+      <w:lvlJc w:val="start"/>
+      <w:pPr>
+        <w:tabs>
+          <w:tab w:val="num" w:pos="2520"/>
+        </w:tabs>
+        <w:ind w:start="2520" w:hanging="360"/>
+      </w:pPr>
+      <w:rPr>
+        <w:rFonts w:ascii="OpenSymbol" w:hAnsi="OpenSymbol" w:cs="OpenSymbol" w:hint="default"/>
+      </w:rPr>
+    </w:lvl>
+    <w:lvl w:ilvl="6">
+      <w:start w:val="1"/>
+      <w:numFmt w:val="bullet"/>
+      <w:lvlText w:val=""/>
+      <w:lvlJc w:val="start"/>
+      <w:pPr>
+        <w:tabs>
+          <w:tab w:val="num" w:pos="2880"/>
+        </w:tabs>
+        <w:ind w:start="2880" w:hanging="360"/>
+      </w:pPr>
+      <w:rPr>
+        <w:rFonts w:ascii="Symbol" w:hAnsi="Symbol" w:cs="Symbol" w:hint="default"/>
+      </w:rPr>
+    </w:lvl>
+    <w:lvl w:ilvl="7">
+      <w:start w:val="1"/>
+      <w:numFmt w:val="bullet"/>
+      <w:lvlText w:val="◦"/>
+      <w:lvlJc w:val="start"/>
+      <w:pPr>
+        <w:tabs>
+          <w:tab w:val="num" w:pos="3240"/>
+        </w:tabs>
+        <w:ind w:start="3240" w:hanging="360"/>
+      </w:pPr>
+      <w:rPr>
+        <w:rFonts w:ascii="OpenSymbol" w:hAnsi="OpenSymbol" w:cs="OpenSymbol" w:hint="default"/>
+      </w:rPr>
+    </w:lvl>
+    <w:lvl w:ilvl="8">
+      <w:start w:val="1"/>
+      <w:numFmt w:val="bullet"/>
+      <w:lvlText w:val="▪"/>
+      <w:lvlJc w:val="start"/>
+      <w:pPr>
+        <w:tabs>
+          <w:tab w:val="num" w:pos="3600"/>
+        </w:tabs>
+        <w:ind w:start="3600" w:hanging="360"/>
+      </w:pPr>
+      <w:rPr>
+        <w:rFonts w:ascii="OpenSymbol" w:hAnsi="OpenSymbol" w:cs="OpenSymbol" w:hint="default"/>
+      </w:rPr>
+    </w:lvl>
+  </w:abstractNum>
+  <w:abstractNum w:abstractNumId="5">
+    <w:lvl w:ilvl="0">
+      <w:start w:val="1"/>
+      <w:numFmt w:val="bullet"/>
+      <w:lvlText w:val=""/>
+      <w:lvlJc w:val="start"/>
+      <w:pPr>
+        <w:tabs>
+          <w:tab w:val="num" w:pos="720"/>
+        </w:tabs>
+        <w:ind w:start="720" w:hanging="360"/>
+      </w:pPr>
+      <w:rPr>
+        <w:rFonts w:ascii="Symbol" w:hAnsi="Symbol" w:cs="Symbol" w:hint="default"/>
+      </w:rPr>
+    </w:lvl>
+    <w:lvl w:ilvl="1">
+      <w:start w:val="1"/>
+      <w:numFmt w:val="bullet"/>
+      <w:lvlText w:val="◦"/>
+      <w:lvlJc w:val="start"/>
+      <w:pPr>
+        <w:tabs>
+          <w:tab w:val="num" w:pos="1080"/>
+        </w:tabs>
+        <w:ind w:start="1080" w:hanging="360"/>
+      </w:pPr>
+      <w:rPr>
+        <w:rFonts w:ascii="OpenSymbol" w:hAnsi="OpenSymbol" w:cs="OpenSymbol" w:hint="default"/>
+      </w:rPr>
+    </w:lvl>
+    <w:lvl w:ilvl="2">
+      <w:start w:val="1"/>
+      <w:numFmt w:val="bullet"/>
+      <w:lvlText w:val="▪"/>
+      <w:lvlJc w:val="start"/>
+      <w:pPr>
+        <w:tabs>
+          <w:tab w:val="num" w:pos="1440"/>
+        </w:tabs>
+        <w:ind w:start="1440" w:hanging="360"/>
+      </w:pPr>
+      <w:rPr>
+        <w:rFonts w:ascii="OpenSymbol" w:hAnsi="OpenSymbol" w:cs="OpenSymbol" w:hint="default"/>
+      </w:rPr>
+    </w:lvl>
+    <w:lvl w:ilvl="3">
+      <w:start w:val="1"/>
+      <w:numFmt w:val="bullet"/>
+      <w:lvlText w:val=""/>
+      <w:lvlJc w:val="start"/>
+      <w:pPr>
+        <w:tabs>
+          <w:tab w:val="num" w:pos="1800"/>
+        </w:tabs>
+        <w:ind w:start="1800" w:hanging="360"/>
+      </w:pPr>
+      <w:rPr>
+        <w:rFonts w:ascii="Symbol" w:hAnsi="Symbol" w:cs="Symbol" w:hint="default"/>
+      </w:rPr>
+    </w:lvl>
+    <w:lvl w:ilvl="4">
+      <w:start w:val="1"/>
+      <w:numFmt w:val="bullet"/>
+      <w:lvlText w:val="◦"/>
+      <w:lvlJc w:val="start"/>
+      <w:pPr>
+        <w:tabs>
+          <w:tab w:val="num" w:pos="2160"/>
+        </w:tabs>
+        <w:ind w:start="2160" w:hanging="360"/>
+      </w:pPr>
+      <w:rPr>
+        <w:rFonts w:ascii="OpenSymbol" w:hAnsi="OpenSymbol" w:cs="OpenSymbol" w:hint="default"/>
+      </w:rPr>
+    </w:lvl>
+    <w:lvl w:ilvl="5">
+      <w:start w:val="1"/>
+      <w:numFmt w:val="bullet"/>
+      <w:lvlText w:val="▪"/>
+      <w:lvlJc w:val="start"/>
+      <w:pPr>
+        <w:tabs>
+          <w:tab w:val="num" w:pos="2520"/>
+        </w:tabs>
+        <w:ind w:start="2520" w:hanging="360"/>
+      </w:pPr>
+      <w:rPr>
+        <w:rFonts w:ascii="OpenSymbol" w:hAnsi="OpenSymbol" w:cs="OpenSymbol" w:hint="default"/>
+      </w:rPr>
+    </w:lvl>
+    <w:lvl w:ilvl="6">
+      <w:start w:val="1"/>
+      <w:numFmt w:val="bullet"/>
+      <w:lvlText w:val=""/>
+      <w:lvlJc w:val="start"/>
+      <w:pPr>
+        <w:tabs>
+          <w:tab w:val="num" w:pos="2880"/>
+        </w:tabs>
+        <w:ind w:start="2880" w:hanging="360"/>
+      </w:pPr>
+      <w:rPr>
+        <w:rFonts w:ascii="Symbol" w:hAnsi="Symbol" w:cs="Symbol" w:hint="default"/>
+      </w:rPr>
+    </w:lvl>
+    <w:lvl w:ilvl="7">
+      <w:start w:val="1"/>
+      <w:numFmt w:val="bullet"/>
+      <w:lvlText w:val="◦"/>
+      <w:lvlJc w:val="start"/>
+      <w:pPr>
+        <w:tabs>
+          <w:tab w:val="num" w:pos="3240"/>
+        </w:tabs>
+        <w:ind w:start="3240" w:hanging="360"/>
+      </w:pPr>
+      <w:rPr>
+        <w:rFonts w:ascii="OpenSymbol" w:hAnsi="OpenSymbol" w:cs="OpenSymbol" w:hint="default"/>
+      </w:rPr>
+    </w:lvl>
+    <w:lvl w:ilvl="8">
+      <w:start w:val="1"/>
+      <w:numFmt w:val="bullet"/>
+      <w:lvlText w:val="▪"/>
+      <w:lvlJc w:val="start"/>
+      <w:pPr>
+        <w:tabs>
+          <w:tab w:val="num" w:pos="3600"/>
+        </w:tabs>
+        <w:ind w:start="3600" w:hanging="360"/>
+      </w:pPr>
+      <w:rPr>
+        <w:rFonts w:ascii="OpenSymbol" w:hAnsi="OpenSymbol" w:cs="OpenSymbol" w:hint="default"/>
+      </w:rPr>
+    </w:lvl>
+  </w:abstractNum>
+  <w:abstractNum w:abstractNumId="6">
+    <w:lvl w:ilvl="0">
+      <w:start w:val="1"/>
       <w:numFmt w:val="none"/>
       <w:suff w:val="nothing"/>
       <w:lvlText w:val=""/>
@@ -1469,6 +2474,15 @@
   </w:num>
   <w:num w:numId="3">
     <w:abstractNumId w:val="3"/>
+  </w:num>
+  <w:num w:numId="4">
+    <w:abstractNumId w:val="4"/>
+  </w:num>
+  <w:num w:numId="5">
+    <w:abstractNumId w:val="5"/>
+  </w:num>
+  <w:num w:numId="6">
+    <w:abstractNumId w:val="6"/>
   </w:num>
 </w:numbering>
 </file>
@@ -1510,15 +2524,32 @@
       <w:lang w:val="en-GB" w:eastAsia="zh-CN" w:bidi="hi-IN"/>
     </w:rPr>
   </w:style>
-  <w:style w:type="character" w:styleId="Bullets">
-    <w:name w:val="Bullets"/>
+  <w:style w:type="paragraph" w:styleId="Heading1">
+    <w:name w:val="heading 1"/>
+    <w:basedOn w:val="Heading"/>
+    <w:qFormat/>
+    <w:pPr>
+      <w:spacing w:before="180" w:after="80"/>
+      <w:outlineLvl w:val="0"/>
+    </w:pPr>
+    <w:rPr>
+      <w:rFonts w:ascii="Arial" w:hAnsi="Arial" w:eastAsia="Arial" w:cs="Arial"/>
+      <w:b/>
+      <w:bCs/>
+      <w:color w:val="1F3864"/>
+      <w:sz w:val="26"/>
+      <w:szCs w:val="26"/>
+    </w:rPr>
+  </w:style>
+  <w:style w:type="character" w:styleId="Bulletsuser">
+    <w:name w:val="Bullets (user)"/>
     <w:qFormat/>
     <w:rPr>
       <w:rFonts w:ascii="OpenSymbol" w:hAnsi="OpenSymbol" w:eastAsia="OpenSymbol" w:cs="OpenSymbol"/>
     </w:rPr>
   </w:style>
-  <w:style w:type="character" w:styleId="Bulletsuser">
-    <w:name w:val="Bullets (user)"/>
+  <w:style w:type="character" w:styleId="Bullets">
+    <w:name w:val="Bullets"/>
     <w:qFormat/>
     <w:rPr>
       <w:rFonts w:ascii="OpenSymbol" w:hAnsi="OpenSymbol" w:eastAsia="OpenSymbol" w:cs="OpenSymbol"/>
@@ -1580,6 +2611,24 @@
     </w:pPr>
     <w:rPr>
       <w:rFonts w:cs="Noto Sans Devanagari"/>
+    </w:rPr>
+  </w:style>
+  <w:style w:type="paragraph" w:styleId="ListParagraph">
+    <w:name w:val="List Paragraph"/>
+    <w:qFormat/>
+    <w:pPr>
+      <w:widowControl/>
+      <w:bidi w:val="0"/>
+      <w:spacing w:before="0" w:after="0"/>
+      <w:jc w:val="start"/>
+    </w:pPr>
+    <w:rPr>
+      <w:rFonts w:ascii="Liberation Serif" w:hAnsi="Liberation Serif" w:eastAsia="Noto Serif CJK SC" w:cs="Noto Sans Devanagari"/>
+      <w:color w:val="auto"/>
+      <w:kern w:val="2"/>
+      <w:sz w:val="24"/>
+      <w:szCs w:val="24"/>
+      <w:lang w:val="en-GB" w:eastAsia="zh-CN" w:bidi="hi-IN"/>
     </w:rPr>
   </w:style>
 </w:styles>

</xml_diff>